<commit_message>
Docs: reorder development plan stages for logical progression
</commit_message>
<xml_diff>
--- a/docs/planning/План розробки.docx
+++ b/docs/planning/План розробки.docx
@@ -2914,7 +2914,519 @@
           <w:szCs w:val="24"/>
           <w:u w:val="single"/>
         </w:rPr>
-        <w:t>Етап 14: DevOps і Реліз</w:t>
+        <w:t>Етап 1</w:t>
+      </w:r>
+      <w:r>
+        <w:rPr>
+          <w:rFonts w:ascii="Times New Roman" w:hAnsi="Times New Roman" w:cs="Times New Roman"/>
+          <w:sz w:val="24"/>
+          <w:szCs w:val="24"/>
+          <w:u w:val="single"/>
+          <w:lang w:val="uk-UA"/>
+        </w:rPr>
+        <w:t>4</w:t>
+      </w:r>
+      <w:r>
+        <w:rPr>
+          <w:rFonts w:ascii="Times New Roman" w:hAnsi="Times New Roman" w:cs="Times New Roman"/>
+          <w:sz w:val="24"/>
+          <w:szCs w:val="24"/>
+          <w:u w:val="single"/>
+        </w:rPr>
+        <w:t>: CRUD-функції</w:t>
+      </w:r>
+    </w:p>
+    <w:p>
+      <w:pPr>
+        <w:pStyle w:val="a4"/>
+        <w:numPr>
+          <w:ilvl w:val="0"/>
+          <w:numId w:val="36"/>
+        </w:numPr>
+        <w:rPr>
+          <w:rFonts w:ascii="Times New Roman" w:hAnsi="Times New Roman" w:cs="Times New Roman"/>
+        </w:rPr>
+      </w:pPr>
+      <w:r>
+        <w:rPr>
+          <w:rFonts w:ascii="Times New Roman" w:hAnsi="Times New Roman" w:cs="Times New Roman"/>
+        </w:rPr>
+        <w:t>Стандартизувати REST CRUD для ключових сутностей; пагінація/сортування/фільтри; пошук; масові операції (bulk create/update/delete).</w:t>
+      </w:r>
+    </w:p>
+    <w:p>
+      <w:pPr>
+        <w:pStyle w:val="a4"/>
+        <w:numPr>
+          <w:ilvl w:val="0"/>
+          <w:numId w:val="36"/>
+        </w:numPr>
+        <w:rPr>
+          <w:rFonts w:ascii="Times New Roman" w:hAnsi="Times New Roman" w:cs="Times New Roman"/>
+        </w:rPr>
+      </w:pPr>
+      <w:r>
+        <w:rPr>
+          <w:rFonts w:ascii="Times New Roman" w:hAnsi="Times New Roman" w:cs="Times New Roman"/>
+        </w:rPr>
+        <w:t>Оновлення: підтримати PUT/PATCH; ідемпотентність для повторних запитів; часткові оновлення без втрати даних.</w:t>
+      </w:r>
+    </w:p>
+    <w:p>
+      <w:pPr>
+        <w:pStyle w:val="a4"/>
+        <w:numPr>
+          <w:ilvl w:val="0"/>
+          <w:numId w:val="36"/>
+        </w:numPr>
+        <w:rPr>
+          <w:rFonts w:ascii="Times New Roman" w:hAnsi="Times New Roman" w:cs="Times New Roman"/>
+        </w:rPr>
+      </w:pPr>
+      <w:r>
+        <w:rPr>
+          <w:rFonts w:ascii="Times New Roman" w:hAnsi="Times New Roman" w:cs="Times New Roman"/>
+        </w:rPr>
+        <w:t>Валідації DTO: унікальність, формати, референційна цілісність; повідомлення локалізовані UA/EN; єдині коди помилок.</w:t>
+      </w:r>
+    </w:p>
+    <w:p>
+      <w:pPr>
+        <w:pStyle w:val="a4"/>
+        <w:numPr>
+          <w:ilvl w:val="0"/>
+          <w:numId w:val="36"/>
+        </w:numPr>
+        <w:rPr>
+          <w:rFonts w:ascii="Times New Roman" w:hAnsi="Times New Roman" w:cs="Times New Roman"/>
+        </w:rPr>
+      </w:pPr>
+      <w:r>
+        <w:rPr>
+          <w:rFonts w:ascii="Times New Roman" w:hAnsi="Times New Roman" w:cs="Times New Roman"/>
+        </w:rPr>
+        <w:t>RBAC: права на перегляд/створення/редагування/видалення за ролями; аудит createdBy/updatedBy/deletedBy; історія змін.</w:t>
+      </w:r>
+    </w:p>
+    <w:p>
+      <w:pPr>
+        <w:pStyle w:val="a4"/>
+        <w:numPr>
+          <w:ilvl w:val="0"/>
+          <w:numId w:val="36"/>
+        </w:numPr>
+        <w:rPr>
+          <w:rFonts w:ascii="Times New Roman" w:hAnsi="Times New Roman" w:cs="Times New Roman"/>
+        </w:rPr>
+      </w:pPr>
+      <w:r>
+        <w:rPr>
+          <w:rFonts w:ascii="Times New Roman" w:hAnsi="Times New Roman" w:cs="Times New Roman"/>
+        </w:rPr>
+        <w:t>М’яке видалення: поля deletedAt/deletedBy; відновлення; заборона видалення сутностей, що використовуються у замовленнях/накладних.</w:t>
+      </w:r>
+    </w:p>
+    <w:p>
+      <w:pPr>
+        <w:pStyle w:val="a4"/>
+        <w:numPr>
+          <w:ilvl w:val="0"/>
+          <w:numId w:val="36"/>
+        </w:numPr>
+        <w:rPr>
+          <w:rFonts w:ascii="Times New Roman" w:hAnsi="Times New Roman" w:cs="Times New Roman"/>
+        </w:rPr>
+      </w:pPr>
+      <w:r>
+        <w:rPr>
+          <w:rFonts w:ascii="Times New Roman" w:hAnsi="Times New Roman" w:cs="Times New Roman"/>
+        </w:rPr>
+        <w:t>Документація: описати всі CRUD у Swagger з прикладами; узгодити назви/статуси; консистентні відповіді.</w:t>
+      </w:r>
+    </w:p>
+    <w:p>
+      <w:pPr>
+        <w:pStyle w:val="a4"/>
+        <w:numPr>
+          <w:ilvl w:val="0"/>
+          <w:numId w:val="36"/>
+        </w:numPr>
+        <w:rPr>
+          <w:rFonts w:ascii="Times New Roman" w:hAnsi="Times New Roman" w:cs="Times New Roman"/>
+        </w:rPr>
+      </w:pPr>
+      <w:r>
+        <w:rPr>
+          <w:rFonts w:ascii="Times New Roman" w:hAnsi="Times New Roman" w:cs="Times New Roman"/>
+        </w:rPr>
+        <w:t>Тести: юніт валідаторів і сервісів; інтеграційні CRUD для Products/Categories/Users/Companies/Promotions/Documents; конкурентні сценарії та блокування.</w:t>
+      </w:r>
+    </w:p>
+    <w:p>
+      <w:pPr>
+        <w:pStyle w:val="a4"/>
+        <w:numPr>
+          <w:ilvl w:val="0"/>
+          <w:numId w:val="36"/>
+        </w:numPr>
+        <w:rPr>
+          <w:rFonts w:ascii="Times New Roman" w:hAnsi="Times New Roman" w:cs="Times New Roman"/>
+        </w:rPr>
+      </w:pPr>
+      <w:r>
+        <w:rPr>
+          <w:rFonts w:ascii="Times New Roman" w:hAnsi="Times New Roman" w:cs="Times New Roman"/>
+        </w:rPr>
+        <w:t>Критерій: всі CRUD працюють узгоджено; адміністратор і менеджер виконують операції самостійно.</w:t>
+      </w:r>
+    </w:p>
+    <w:p>
+      <w:pPr>
+        <w:rPr>
+          <w:rFonts w:ascii="Times New Roman" w:hAnsi="Times New Roman" w:cs="Times New Roman"/>
+          <w:sz w:val="24"/>
+          <w:szCs w:val="24"/>
+          <w:u w:val="single"/>
+        </w:rPr>
+      </w:pPr>
+      <w:r>
+        <w:rPr>
+          <w:rFonts w:ascii="Times New Roman" w:hAnsi="Times New Roman" w:cs="Times New Roman"/>
+          <w:sz w:val="24"/>
+          <w:szCs w:val="24"/>
+          <w:u w:val="single"/>
+        </w:rPr>
+        <w:t>Етап 1</w:t>
+      </w:r>
+      <w:r>
+        <w:rPr>
+          <w:rFonts w:ascii="Times New Roman" w:hAnsi="Times New Roman" w:cs="Times New Roman"/>
+          <w:sz w:val="24"/>
+          <w:szCs w:val="24"/>
+          <w:u w:val="single"/>
+          <w:lang w:val="uk-UA"/>
+        </w:rPr>
+        <w:t>5</w:t>
+      </w:r>
+      <w:r>
+        <w:rPr>
+          <w:rFonts w:ascii="Times New Roman" w:hAnsi="Times New Roman" w:cs="Times New Roman"/>
+          <w:sz w:val="24"/>
+          <w:szCs w:val="24"/>
+          <w:u w:val="single"/>
+        </w:rPr>
+        <w:t>: Власний поштовий сервер</w:t>
+      </w:r>
+    </w:p>
+    <w:p>
+      <w:pPr>
+        <w:pStyle w:val="a4"/>
+        <w:numPr>
+          <w:ilvl w:val="0"/>
+          <w:numId w:val="37"/>
+        </w:numPr>
+        <w:rPr>
+          <w:rFonts w:ascii="Times New Roman" w:hAnsi="Times New Roman" w:cs="Times New Roman"/>
+        </w:rPr>
+      </w:pPr>
+      <w:r>
+        <w:rPr>
+          <w:rFonts w:ascii="Times New Roman" w:hAnsi="Times New Roman" w:cs="Times New Roman"/>
+        </w:rPr>
+        <w:t>Інфраструктура: власний SMTP-сервер (Postfix/Dovecot) у Docker; TLS (Let's Encrypt); налаштування SPF/DKIM/DMARC; PTR запис; окремий домен/піддомен.</w:t>
+      </w:r>
+    </w:p>
+    <w:p>
+      <w:pPr>
+        <w:pStyle w:val="a4"/>
+        <w:numPr>
+          <w:ilvl w:val="0"/>
+          <w:numId w:val="37"/>
+        </w:numPr>
+        <w:rPr>
+          <w:rFonts w:ascii="Times New Roman" w:hAnsi="Times New Roman" w:cs="Times New Roman"/>
+        </w:rPr>
+      </w:pPr>
+      <w:r>
+        <w:rPr>
+          <w:rFonts w:ascii="Times New Roman" w:hAnsi="Times New Roman" w:cs="Times New Roman"/>
+        </w:rPr>
+        <w:t>Доставність: rate limiting, черга з ретраями; обробка bounce/complaints; захист від спаму (greylisting/blacklist).</w:t>
+      </w:r>
+    </w:p>
+    <w:p>
+      <w:pPr>
+        <w:pStyle w:val="a4"/>
+        <w:numPr>
+          <w:ilvl w:val="0"/>
+          <w:numId w:val="37"/>
+        </w:numPr>
+        <w:rPr>
+          <w:rFonts w:ascii="Times New Roman" w:hAnsi="Times New Roman" w:cs="Times New Roman"/>
+        </w:rPr>
+      </w:pPr>
+      <w:r>
+        <w:rPr>
+          <w:rFonts w:ascii="Times New Roman" w:hAnsi="Times New Roman" w:cs="Times New Roman"/>
+        </w:rPr>
+        <w:t>Інтеграція: змінні оточення SMTP_*; підключення до модуля Нотифікацій з Етапу 7; фолбек на зовнішній провайдер; idempotency відправок.</w:t>
+      </w:r>
+    </w:p>
+    <w:p>
+      <w:pPr>
+        <w:pStyle w:val="a4"/>
+        <w:numPr>
+          <w:ilvl w:val="0"/>
+          <w:numId w:val="37"/>
+        </w:numPr>
+        <w:rPr>
+          <w:rFonts w:ascii="Times New Roman" w:hAnsi="Times New Roman" w:cs="Times New Roman"/>
+        </w:rPr>
+      </w:pPr>
+      <w:r>
+        <w:rPr>
+          <w:rFonts w:ascii="Times New Roman" w:hAnsi="Times New Roman" w:cs="Times New Roman"/>
+        </w:rPr>
+        <w:t>Моніторинг: дашборд статусів пошти; логи; метрики доставності; алерти на збої/відмови.</w:t>
+      </w:r>
+    </w:p>
+    <w:p>
+      <w:pPr>
+        <w:pStyle w:val="a4"/>
+        <w:numPr>
+          <w:ilvl w:val="0"/>
+          <w:numId w:val="37"/>
+        </w:numPr>
+        <w:rPr>
+          <w:rFonts w:ascii="Times New Roman" w:hAnsi="Times New Roman" w:cs="Times New Roman"/>
+        </w:rPr>
+      </w:pPr>
+      <w:r>
+        <w:rPr>
+          <w:rFonts w:ascii="Times New Roman" w:hAnsi="Times New Roman" w:cs="Times New Roman"/>
+        </w:rPr>
+        <w:t>Безпека: аутентифікація, обов’язковий TLS, обмеження доступу; секрети лише в env; захист від брутфорсу (fail2ban).</w:t>
+      </w:r>
+    </w:p>
+    <w:p>
+      <w:pPr>
+        <w:pStyle w:val="a4"/>
+        <w:numPr>
+          <w:ilvl w:val="0"/>
+          <w:numId w:val="37"/>
+        </w:numPr>
+        <w:rPr>
+          <w:rFonts w:ascii="Times New Roman" w:hAnsi="Times New Roman" w:cs="Times New Roman"/>
+        </w:rPr>
+      </w:pPr>
+      <w:r>
+        <w:rPr>
+          <w:rFonts w:ascii="Times New Roman" w:hAnsi="Times New Roman" w:cs="Times New Roman"/>
+        </w:rPr>
+        <w:t>Оперування: управління аліасами/скриньками; обмеження розміру вкладень; архівування; політика зберігання.</w:t>
+      </w:r>
+    </w:p>
+    <w:p>
+      <w:pPr>
+        <w:pStyle w:val="a4"/>
+        <w:numPr>
+          <w:ilvl w:val="0"/>
+          <w:numId w:val="37"/>
+        </w:numPr>
+        <w:rPr>
+          <w:rFonts w:ascii="Times New Roman" w:hAnsi="Times New Roman" w:cs="Times New Roman"/>
+        </w:rPr>
+      </w:pPr>
+      <w:r>
+        <w:rPr>
+          <w:rFonts w:ascii="Times New Roman" w:hAnsi="Times New Roman" w:cs="Times New Roman"/>
+        </w:rPr>
+        <w:t>Тести: перевірка SPF/DKIM/DMARC; відправлення на поштові сервіси (Gmail/Outlook/Yahoo) у sandbox; негативні кейси; ретраї/фолбеки.</w:t>
+      </w:r>
+    </w:p>
+    <w:p>
+      <w:pPr>
+        <w:pStyle w:val="a4"/>
+        <w:numPr>
+          <w:ilvl w:val="0"/>
+          <w:numId w:val="37"/>
+        </w:numPr>
+        <w:rPr>
+          <w:rFonts w:ascii="Times New Roman" w:hAnsi="Times New Roman" w:cs="Times New Roman"/>
+        </w:rPr>
+      </w:pPr>
+      <w:r>
+        <w:rPr>
+          <w:rFonts w:ascii="Times New Roman" w:hAnsi="Times New Roman" w:cs="Times New Roman"/>
+        </w:rPr>
+        <w:t>Критерій: листи доставляються у inbox; стабільна робота під навантаженням; інтеграція з шаблонами працює.</w:t>
+      </w:r>
+    </w:p>
+    <w:p>
+      <w:pPr>
+        <w:rPr>
+          <w:rFonts w:ascii="Times New Roman" w:hAnsi="Times New Roman" w:cs="Times New Roman"/>
+          <w:sz w:val="24"/>
+          <w:szCs w:val="24"/>
+          <w:u w:val="single"/>
+        </w:rPr>
+      </w:pPr>
+      <w:r>
+        <w:rPr>
+          <w:rFonts w:ascii="Times New Roman" w:hAnsi="Times New Roman" w:cs="Times New Roman"/>
+          <w:sz w:val="24"/>
+          <w:szCs w:val="24"/>
+          <w:u w:val="single"/>
+        </w:rPr>
+        <w:t>Етап 1</w:t>
+      </w:r>
+      <w:r>
+        <w:rPr>
+          <w:rFonts w:ascii="Times New Roman" w:hAnsi="Times New Roman" w:cs="Times New Roman"/>
+          <w:sz w:val="24"/>
+          <w:szCs w:val="24"/>
+          <w:u w:val="single"/>
+          <w:lang w:val="uk-UA"/>
+        </w:rPr>
+        <w:t>6</w:t>
+      </w:r>
+      <w:r>
+        <w:rPr>
+          <w:rFonts w:ascii="Times New Roman" w:hAnsi="Times New Roman" w:cs="Times New Roman"/>
+          <w:sz w:val="24"/>
+          <w:szCs w:val="24"/>
+          <w:u w:val="single"/>
+        </w:rPr>
+        <w:t>: Фінальний Лонч Чекліст</w:t>
+      </w:r>
+    </w:p>
+    <w:p>
+      <w:pPr>
+        <w:pStyle w:val="a4"/>
+        <w:numPr>
+          <w:ilvl w:val="0"/>
+          <w:numId w:val="35"/>
+        </w:numPr>
+        <w:rPr>
+          <w:rFonts w:ascii="Times New Roman" w:hAnsi="Times New Roman" w:cs="Times New Roman"/>
+        </w:rPr>
+      </w:pPr>
+      <w:r>
+        <w:rPr>
+          <w:rFonts w:ascii="Times New Roman" w:hAnsi="Times New Roman" w:cs="Times New Roman"/>
+        </w:rPr>
+        <w:t>Інтеграції активні з зеленими індикаторами; webhook Stripe працює; Nova Poshta ключ валідний; University API перевірено.</w:t>
+      </w:r>
+    </w:p>
+    <w:p>
+      <w:pPr>
+        <w:pStyle w:val="a4"/>
+        <w:numPr>
+          <w:ilvl w:val="0"/>
+          <w:numId w:val="35"/>
+        </w:numPr>
+        <w:rPr>
+          <w:rFonts w:ascii="Times New Roman" w:hAnsi="Times New Roman" w:cs="Times New Roman"/>
+        </w:rPr>
+      </w:pPr>
+      <w:r>
+        <w:rPr>
+          <w:rFonts w:ascii="Times New Roman" w:hAnsi="Times New Roman" w:cs="Times New Roman"/>
+        </w:rPr>
+        <w:t>Документація доступна: Swagger; сторінки Політик/Повернень; контакти.</w:t>
+      </w:r>
+    </w:p>
+    <w:p>
+      <w:pPr>
+        <w:pStyle w:val="a4"/>
+        <w:numPr>
+          <w:ilvl w:val="0"/>
+          <w:numId w:val="35"/>
+        </w:numPr>
+        <w:rPr>
+          <w:rFonts w:ascii="Times New Roman" w:hAnsi="Times New Roman" w:cs="Times New Roman"/>
+        </w:rPr>
+      </w:pPr>
+      <w:r>
+        <w:rPr>
+          <w:rFonts w:ascii="Times New Roman" w:hAnsi="Times New Roman" w:cs="Times New Roman"/>
+        </w:rPr>
+        <w:t>Е2Е сценарії: гості/користувачі/менеджери/адміністратори/суперадміни; негативні кейси оплати/доставки.</w:t>
+      </w:r>
+    </w:p>
+    <w:p>
+      <w:pPr>
+        <w:pStyle w:val="a4"/>
+        <w:numPr>
+          <w:ilvl w:val="0"/>
+          <w:numId w:val="35"/>
+        </w:numPr>
+        <w:rPr>
+          <w:rFonts w:ascii="Times New Roman" w:hAnsi="Times New Roman" w:cs="Times New Roman"/>
+        </w:rPr>
+      </w:pPr>
+      <w:r>
+        <w:rPr>
+          <w:rFonts w:ascii="Times New Roman" w:hAnsi="Times New Roman" w:cs="Times New Roman"/>
+        </w:rPr>
+        <w:lastRenderedPageBreak/>
+        <w:t>Стейджинг пройшов UAT; прод готовий; фічефлаги для поступового вмикання.</w:t>
+      </w:r>
+    </w:p>
+    <w:p>
+      <w:pPr>
+        <w:pStyle w:val="a4"/>
+        <w:numPr>
+          <w:ilvl w:val="0"/>
+          <w:numId w:val="35"/>
+        </w:numPr>
+        <w:rPr>
+          <w:rFonts w:ascii="Times New Roman" w:hAnsi="Times New Roman" w:cs="Times New Roman"/>
+        </w:rPr>
+      </w:pPr>
+      <w:r>
+        <w:rPr>
+          <w:rFonts w:ascii="Times New Roman" w:hAnsi="Times New Roman" w:cs="Times New Roman"/>
+        </w:rPr>
+        <w:t>Пострелізні процедури: моніторинг, канали підтримки, швидке виправлення інцидентів.</w:t>
+      </w:r>
+    </w:p>
+    <w:p>
+      <w:pPr>
+        <w:rPr>
+          <w:rFonts w:ascii="Times New Roman" w:hAnsi="Times New Roman" w:cs="Times New Roman"/>
+          <w:sz w:val="24"/>
+          <w:szCs w:val="24"/>
+          <w:u w:val="single"/>
+        </w:rPr>
+      </w:pPr>
+      <w:r>
+        <w:rPr>
+          <w:rFonts w:ascii="Times New Roman" w:hAnsi="Times New Roman" w:cs="Times New Roman"/>
+          <w:sz w:val="24"/>
+          <w:szCs w:val="24"/>
+          <w:u w:val="single"/>
+        </w:rPr>
+        <w:t>Етап 1</w:t>
+      </w:r>
+      <w:r>
+        <w:rPr>
+          <w:rFonts w:ascii="Times New Roman" w:hAnsi="Times New Roman" w:cs="Times New Roman"/>
+          <w:sz w:val="24"/>
+          <w:szCs w:val="24"/>
+          <w:u w:val="single"/>
+          <w:lang w:val="uk-UA"/>
+        </w:rPr>
+        <w:t>7</w:t>
+      </w:r>
+      <w:r>
+        <w:rPr>
+          <w:rFonts w:ascii="Times New Roman" w:hAnsi="Times New Roman" w:cs="Times New Roman"/>
+          <w:sz w:val="24"/>
+          <w:szCs w:val="24"/>
+          <w:u w:val="single"/>
+        </w:rPr>
+        <w:t>: DevOps і Реліз</w:t>
       </w:r>
     </w:p>
     <w:p>
@@ -3033,442 +3545,6 @@
           <w:rFonts w:ascii="Times New Roman" w:hAnsi="Times New Roman" w:cs="Times New Roman"/>
         </w:rPr>
         <w:t>Критерій: стабільний релізний цикл; швидке відновлення після збоїв.</w:t>
-      </w:r>
-    </w:p>
-    <w:p>
-      <w:pPr>
-        <w:rPr>
-          <w:rFonts w:ascii="Times New Roman" w:hAnsi="Times New Roman" w:cs="Times New Roman"/>
-          <w:sz w:val="24"/>
-          <w:szCs w:val="24"/>
-          <w:u w:val="single"/>
-        </w:rPr>
-      </w:pPr>
-      <w:r>
-        <w:rPr>
-          <w:rFonts w:ascii="Times New Roman" w:hAnsi="Times New Roman" w:cs="Times New Roman"/>
-          <w:sz w:val="24"/>
-          <w:szCs w:val="24"/>
-          <w:u w:val="single"/>
-        </w:rPr>
-        <w:t>Етап 15: Фінальний Лонч Чекліст</w:t>
-      </w:r>
-    </w:p>
-    <w:p>
-      <w:pPr>
-        <w:pStyle w:val="a4"/>
-        <w:numPr>
-          <w:ilvl w:val="0"/>
-          <w:numId w:val="35"/>
-        </w:numPr>
-        <w:rPr>
-          <w:rFonts w:ascii="Times New Roman" w:hAnsi="Times New Roman" w:cs="Times New Roman"/>
-        </w:rPr>
-      </w:pPr>
-      <w:r>
-        <w:rPr>
-          <w:rFonts w:ascii="Times New Roman" w:hAnsi="Times New Roman" w:cs="Times New Roman"/>
-        </w:rPr>
-        <w:t>Інтеграції активні з зеленими індикаторами; webhook Stripe працює; Nova Poshta ключ валідний; University API перевірено.</w:t>
-      </w:r>
-    </w:p>
-    <w:p>
-      <w:pPr>
-        <w:pStyle w:val="a4"/>
-        <w:numPr>
-          <w:ilvl w:val="0"/>
-          <w:numId w:val="35"/>
-        </w:numPr>
-        <w:rPr>
-          <w:rFonts w:ascii="Times New Roman" w:hAnsi="Times New Roman" w:cs="Times New Roman"/>
-        </w:rPr>
-      </w:pPr>
-      <w:r>
-        <w:rPr>
-          <w:rFonts w:ascii="Times New Roman" w:hAnsi="Times New Roman" w:cs="Times New Roman"/>
-        </w:rPr>
-        <w:t>Документація доступна: Swagger; сторінки Політик/Повернень; контакти.</w:t>
-      </w:r>
-    </w:p>
-    <w:p>
-      <w:pPr>
-        <w:pStyle w:val="a4"/>
-        <w:numPr>
-          <w:ilvl w:val="0"/>
-          <w:numId w:val="35"/>
-        </w:numPr>
-        <w:rPr>
-          <w:rFonts w:ascii="Times New Roman" w:hAnsi="Times New Roman" w:cs="Times New Roman"/>
-        </w:rPr>
-      </w:pPr>
-      <w:r>
-        <w:rPr>
-          <w:rFonts w:ascii="Times New Roman" w:hAnsi="Times New Roman" w:cs="Times New Roman"/>
-        </w:rPr>
-        <w:t>Е2Е сценарії: гості/користувачі/менеджери/адміністратори/суперадміни; негативні кейси оплати/доставки.</w:t>
-      </w:r>
-    </w:p>
-    <w:p>
-      <w:pPr>
-        <w:pStyle w:val="a4"/>
-        <w:numPr>
-          <w:ilvl w:val="0"/>
-          <w:numId w:val="35"/>
-        </w:numPr>
-        <w:rPr>
-          <w:rFonts w:ascii="Times New Roman" w:hAnsi="Times New Roman" w:cs="Times New Roman"/>
-        </w:rPr>
-      </w:pPr>
-      <w:r>
-        <w:rPr>
-          <w:rFonts w:ascii="Times New Roman" w:hAnsi="Times New Roman" w:cs="Times New Roman"/>
-        </w:rPr>
-        <w:t>Стейджинг пройшов UAT; прод готовий; фічефлаги для поступового вмикання.</w:t>
-      </w:r>
-    </w:p>
-    <w:p>
-      <w:pPr>
-        <w:pStyle w:val="a4"/>
-        <w:numPr>
-          <w:ilvl w:val="0"/>
-          <w:numId w:val="35"/>
-        </w:numPr>
-        <w:rPr>
-          <w:rFonts w:ascii="Times New Roman" w:hAnsi="Times New Roman" w:cs="Times New Roman"/>
-        </w:rPr>
-      </w:pPr>
-      <w:r>
-        <w:rPr>
-          <w:rFonts w:ascii="Times New Roman" w:hAnsi="Times New Roman" w:cs="Times New Roman"/>
-        </w:rPr>
-        <w:t>Пострелізні процедури: моніторинг, канали підтримки, швидке виправлення інцидентів.</w:t>
-      </w:r>
-    </w:p>
-    <w:p>
-      <w:pPr>
-        <w:rPr>
-          <w:rFonts w:ascii="Times New Roman" w:hAnsi="Times New Roman" w:cs="Times New Roman"/>
-          <w:sz w:val="24"/>
-          <w:szCs w:val="24"/>
-          <w:u w:val="single"/>
-        </w:rPr>
-      </w:pPr>
-      <w:r>
-        <w:rPr>
-          <w:rFonts w:ascii="Times New Roman" w:hAnsi="Times New Roman" w:cs="Times New Roman"/>
-          <w:sz w:val="24"/>
-          <w:szCs w:val="24"/>
-          <w:u w:val="single"/>
-        </w:rPr>
-        <w:t>Етап 16: CRUD-функції</w:t>
-      </w:r>
-    </w:p>
-    <w:p>
-      <w:pPr>
-        <w:pStyle w:val="a4"/>
-        <w:numPr>
-          <w:ilvl w:val="0"/>
-          <w:numId w:val="36"/>
-        </w:numPr>
-        <w:rPr>
-          <w:rFonts w:ascii="Times New Roman" w:hAnsi="Times New Roman" w:cs="Times New Roman"/>
-        </w:rPr>
-      </w:pPr>
-      <w:r>
-        <w:rPr>
-          <w:rFonts w:ascii="Times New Roman" w:hAnsi="Times New Roman" w:cs="Times New Roman"/>
-        </w:rPr>
-        <w:t>Стандартизувати REST CRUD для ключових сутностей; пагінація/сортування/фільтри; пошук; масові операції (bulk create/update/delete).</w:t>
-      </w:r>
-    </w:p>
-    <w:p>
-      <w:pPr>
-        <w:pStyle w:val="a4"/>
-        <w:numPr>
-          <w:ilvl w:val="0"/>
-          <w:numId w:val="36"/>
-        </w:numPr>
-        <w:rPr>
-          <w:rFonts w:ascii="Times New Roman" w:hAnsi="Times New Roman" w:cs="Times New Roman"/>
-        </w:rPr>
-      </w:pPr>
-      <w:r>
-        <w:rPr>
-          <w:rFonts w:ascii="Times New Roman" w:hAnsi="Times New Roman" w:cs="Times New Roman"/>
-        </w:rPr>
-        <w:t>Оновлення: підтримати PUT/PATCH; ідемпотентність для повторних запитів; часткові оновлення без втрати даних.</w:t>
-      </w:r>
-    </w:p>
-    <w:p>
-      <w:pPr>
-        <w:pStyle w:val="a4"/>
-        <w:numPr>
-          <w:ilvl w:val="0"/>
-          <w:numId w:val="36"/>
-        </w:numPr>
-        <w:rPr>
-          <w:rFonts w:ascii="Times New Roman" w:hAnsi="Times New Roman" w:cs="Times New Roman"/>
-        </w:rPr>
-      </w:pPr>
-      <w:r>
-        <w:rPr>
-          <w:rFonts w:ascii="Times New Roman" w:hAnsi="Times New Roman" w:cs="Times New Roman"/>
-        </w:rPr>
-        <w:t>Валідації DTO: унікальність, формати, референційна цілісність; повідомлення локалізовані UA/EN; єдині коди помилок.</w:t>
-      </w:r>
-    </w:p>
-    <w:p>
-      <w:pPr>
-        <w:pStyle w:val="a4"/>
-        <w:numPr>
-          <w:ilvl w:val="0"/>
-          <w:numId w:val="36"/>
-        </w:numPr>
-        <w:rPr>
-          <w:rFonts w:ascii="Times New Roman" w:hAnsi="Times New Roman" w:cs="Times New Roman"/>
-        </w:rPr>
-      </w:pPr>
-      <w:r>
-        <w:rPr>
-          <w:rFonts w:ascii="Times New Roman" w:hAnsi="Times New Roman" w:cs="Times New Roman"/>
-        </w:rPr>
-        <w:t>RBAC: права на перегляд/створення/редагування/видалення за ролями; аудит createdBy/updatedBy/deletedBy; історія змін.</w:t>
-      </w:r>
-    </w:p>
-    <w:p>
-      <w:pPr>
-        <w:pStyle w:val="a4"/>
-        <w:numPr>
-          <w:ilvl w:val="0"/>
-          <w:numId w:val="36"/>
-        </w:numPr>
-        <w:rPr>
-          <w:rFonts w:ascii="Times New Roman" w:hAnsi="Times New Roman" w:cs="Times New Roman"/>
-        </w:rPr>
-      </w:pPr>
-      <w:r>
-        <w:rPr>
-          <w:rFonts w:ascii="Times New Roman" w:hAnsi="Times New Roman" w:cs="Times New Roman"/>
-        </w:rPr>
-        <w:t>М’яке видалення: поля deletedAt/deletedBy; відновлення; заборона видалення сутностей, що використовуються у замовленнях/накладних.</w:t>
-      </w:r>
-    </w:p>
-    <w:p>
-      <w:pPr>
-        <w:pStyle w:val="a4"/>
-        <w:numPr>
-          <w:ilvl w:val="0"/>
-          <w:numId w:val="36"/>
-        </w:numPr>
-        <w:rPr>
-          <w:rFonts w:ascii="Times New Roman" w:hAnsi="Times New Roman" w:cs="Times New Roman"/>
-        </w:rPr>
-      </w:pPr>
-      <w:r>
-        <w:rPr>
-          <w:rFonts w:ascii="Times New Roman" w:hAnsi="Times New Roman" w:cs="Times New Roman"/>
-        </w:rPr>
-        <w:t>Документація: описати всі CRUD у Swagger з прикладами; узгодити назви/статуси; консистентні відповіді.</w:t>
-      </w:r>
-    </w:p>
-    <w:p>
-      <w:pPr>
-        <w:pStyle w:val="a4"/>
-        <w:numPr>
-          <w:ilvl w:val="0"/>
-          <w:numId w:val="36"/>
-        </w:numPr>
-        <w:rPr>
-          <w:rFonts w:ascii="Times New Roman" w:hAnsi="Times New Roman" w:cs="Times New Roman"/>
-        </w:rPr>
-      </w:pPr>
-      <w:r>
-        <w:rPr>
-          <w:rFonts w:ascii="Times New Roman" w:hAnsi="Times New Roman" w:cs="Times New Roman"/>
-        </w:rPr>
-        <w:t>Тести: юніт валідаторів і сервісів; інтеграційні CRUD для Products/Categories/Users/Companies/Promotions/Documents; конкурентні сценарії та блокування.</w:t>
-      </w:r>
-    </w:p>
-    <w:p>
-      <w:pPr>
-        <w:pStyle w:val="a4"/>
-        <w:numPr>
-          <w:ilvl w:val="0"/>
-          <w:numId w:val="36"/>
-        </w:numPr>
-        <w:rPr>
-          <w:rFonts w:ascii="Times New Roman" w:hAnsi="Times New Roman" w:cs="Times New Roman"/>
-        </w:rPr>
-      </w:pPr>
-      <w:r>
-        <w:rPr>
-          <w:rFonts w:ascii="Times New Roman" w:hAnsi="Times New Roman" w:cs="Times New Roman"/>
-        </w:rPr>
-        <w:t>Критерій: всі CRUD працюють узгоджено; адміністратор і менеджер виконують операції самостійно.</w:t>
-      </w:r>
-    </w:p>
-    <w:p>
-      <w:pPr>
-        <w:rPr>
-          <w:rFonts w:ascii="Times New Roman" w:hAnsi="Times New Roman" w:cs="Times New Roman"/>
-          <w:sz w:val="24"/>
-          <w:szCs w:val="24"/>
-          <w:u w:val="single"/>
-        </w:rPr>
-      </w:pPr>
-      <w:r>
-        <w:rPr>
-          <w:rFonts w:ascii="Times New Roman" w:hAnsi="Times New Roman" w:cs="Times New Roman"/>
-          <w:sz w:val="24"/>
-          <w:szCs w:val="24"/>
-          <w:u w:val="single"/>
-        </w:rPr>
-        <w:t>Етап 17: Власний поштовий сервер</w:t>
-      </w:r>
-    </w:p>
-    <w:p>
-      <w:pPr>
-        <w:pStyle w:val="a4"/>
-        <w:numPr>
-          <w:ilvl w:val="0"/>
-          <w:numId w:val="37"/>
-        </w:numPr>
-        <w:rPr>
-          <w:rFonts w:ascii="Times New Roman" w:hAnsi="Times New Roman" w:cs="Times New Roman"/>
-        </w:rPr>
-      </w:pPr>
-      <w:r>
-        <w:rPr>
-          <w:rFonts w:ascii="Times New Roman" w:hAnsi="Times New Roman" w:cs="Times New Roman"/>
-        </w:rPr>
-        <w:t>Інфраструктура: власний SMTP-сервер (Postfix/Dovecot) у Docker; TLS (Let's Encrypt); налаштування SPF/DKIM/DMARC; PTR запис; окремий домен/піддомен.</w:t>
-      </w:r>
-    </w:p>
-    <w:p>
-      <w:pPr>
-        <w:pStyle w:val="a4"/>
-        <w:numPr>
-          <w:ilvl w:val="0"/>
-          <w:numId w:val="37"/>
-        </w:numPr>
-        <w:rPr>
-          <w:rFonts w:ascii="Times New Roman" w:hAnsi="Times New Roman" w:cs="Times New Roman"/>
-        </w:rPr>
-      </w:pPr>
-      <w:r>
-        <w:rPr>
-          <w:rFonts w:ascii="Times New Roman" w:hAnsi="Times New Roman" w:cs="Times New Roman"/>
-        </w:rPr>
-        <w:t>Доставність: rate limiting, черга з ретраями; обробка bounce/complaints; захист від спаму (greylisting/blacklist).</w:t>
-      </w:r>
-    </w:p>
-    <w:p>
-      <w:pPr>
-        <w:pStyle w:val="a4"/>
-        <w:numPr>
-          <w:ilvl w:val="0"/>
-          <w:numId w:val="37"/>
-        </w:numPr>
-        <w:rPr>
-          <w:rFonts w:ascii="Times New Roman" w:hAnsi="Times New Roman" w:cs="Times New Roman"/>
-        </w:rPr>
-      </w:pPr>
-      <w:r>
-        <w:rPr>
-          <w:rFonts w:ascii="Times New Roman" w:hAnsi="Times New Roman" w:cs="Times New Roman"/>
-        </w:rPr>
-        <w:lastRenderedPageBreak/>
-        <w:t>Інтеграція: змінні оточення SMTP_*; підключення до модуля Нотифікацій з Етапу 7; фолбек на зовнішній провайдер; idempotency відправок.</w:t>
-      </w:r>
-    </w:p>
-    <w:p>
-      <w:pPr>
-        <w:pStyle w:val="a4"/>
-        <w:numPr>
-          <w:ilvl w:val="0"/>
-          <w:numId w:val="37"/>
-        </w:numPr>
-        <w:rPr>
-          <w:rFonts w:ascii="Times New Roman" w:hAnsi="Times New Roman" w:cs="Times New Roman"/>
-        </w:rPr>
-      </w:pPr>
-      <w:r>
-        <w:rPr>
-          <w:rFonts w:ascii="Times New Roman" w:hAnsi="Times New Roman" w:cs="Times New Roman"/>
-        </w:rPr>
-        <w:t>Моніторинг: дашборд статусів пошти; логи; метрики доставності; алерти на збої/відмови.</w:t>
-      </w:r>
-    </w:p>
-    <w:p>
-      <w:pPr>
-        <w:pStyle w:val="a4"/>
-        <w:numPr>
-          <w:ilvl w:val="0"/>
-          <w:numId w:val="37"/>
-        </w:numPr>
-        <w:rPr>
-          <w:rFonts w:ascii="Times New Roman" w:hAnsi="Times New Roman" w:cs="Times New Roman"/>
-        </w:rPr>
-      </w:pPr>
-      <w:r>
-        <w:rPr>
-          <w:rFonts w:ascii="Times New Roman" w:hAnsi="Times New Roman" w:cs="Times New Roman"/>
-        </w:rPr>
-        <w:t>Безпека: аутентифікація, обов’язковий TLS, обмеження доступу; секрети лише в env; захист від брутфорсу (fail2ban).</w:t>
-      </w:r>
-    </w:p>
-    <w:p>
-      <w:pPr>
-        <w:pStyle w:val="a4"/>
-        <w:numPr>
-          <w:ilvl w:val="0"/>
-          <w:numId w:val="37"/>
-        </w:numPr>
-        <w:rPr>
-          <w:rFonts w:ascii="Times New Roman" w:hAnsi="Times New Roman" w:cs="Times New Roman"/>
-        </w:rPr>
-      </w:pPr>
-      <w:r>
-        <w:rPr>
-          <w:rFonts w:ascii="Times New Roman" w:hAnsi="Times New Roman" w:cs="Times New Roman"/>
-        </w:rPr>
-        <w:t>Оперування: управління аліасами/скриньками; обмеження розміру вкладень; архівування; політика зберігання.</w:t>
-      </w:r>
-    </w:p>
-    <w:p>
-      <w:pPr>
-        <w:pStyle w:val="a4"/>
-        <w:numPr>
-          <w:ilvl w:val="0"/>
-          <w:numId w:val="37"/>
-        </w:numPr>
-        <w:rPr>
-          <w:rFonts w:ascii="Times New Roman" w:hAnsi="Times New Roman" w:cs="Times New Roman"/>
-        </w:rPr>
-      </w:pPr>
-      <w:r>
-        <w:rPr>
-          <w:rFonts w:ascii="Times New Roman" w:hAnsi="Times New Roman" w:cs="Times New Roman"/>
-        </w:rPr>
-        <w:t>Тести: перевірка SPF/DKIM/DMARC; відправлення на поштові сервіси (Gmail/Outlook/Yahoo) у sandbox; негативні кейси; ретраї/фолбеки.</w:t>
-      </w:r>
-    </w:p>
-    <w:p>
-      <w:pPr>
-        <w:pStyle w:val="a4"/>
-        <w:numPr>
-          <w:ilvl w:val="0"/>
-          <w:numId w:val="37"/>
-        </w:numPr>
-        <w:rPr>
-          <w:rFonts w:ascii="Times New Roman" w:hAnsi="Times New Roman" w:cs="Times New Roman"/>
-        </w:rPr>
-      </w:pPr>
-      <w:r>
-        <w:rPr>
-          <w:rFonts w:ascii="Times New Roman" w:hAnsi="Times New Roman" w:cs="Times New Roman"/>
-        </w:rPr>
-        <w:t>Критерій: листи доставляються у inbox; стабільна робота під навантаженням; інтеграція з шаблонами працює.</w:t>
       </w:r>
     </w:p>
     <w:p>

</xml_diff>